<commit_message>
models.py fix: added users added and other check
</commit_message>
<xml_diff>
--- a/documentation.docx
+++ b/documentation.docx
@@ -3,6 +3,7 @@
 <w:document xmlns:wpc="http://schemas.microsoft.com/office/word/2010/wordprocessingCanvas" xmlns:cx="http://schemas.microsoft.com/office/drawing/2014/chartex" xmlns:cx1="http://schemas.microsoft.com/office/drawing/2015/9/8/chartex" xmlns:cx2="http://schemas.microsoft.com/office/drawing/2015/10/21/chartex" xmlns:cx3="http://schemas.microsoft.com/office/drawing/2016/5/9/chartex" xmlns:cx4="http://schemas.microsoft.com/office/drawing/2016/5/10/chartex" xmlns:cx5="http://schemas.microsoft.com/office/drawing/2016/5/11/chartex" xmlns:cx6="http://schemas.microsoft.com/office/drawing/2016/5/12/chartex" xmlns:cx7="http://schemas.microsoft.com/office/drawing/2016/5/13/chartex" xmlns:cx8="http://schemas.microsoft.com/office/drawing/2016/5/14/chartex" xmlns:mc="http://schemas.openxmlformats.org/markup-compatibility/2006" xmlns:aink="http://schemas.microsoft.com/office/drawing/2016/ink" xmlns:am3d="http://schemas.microsoft.com/office/drawing/2017/model3d" xmlns:o="urn:schemas-microsoft-com:office:office" xmlns:oel="http://schemas.microsoft.com/office/2019/extlst" xmlns:r="http://schemas.openxmlformats.org/officeDocument/2006/relationships" xmlns:m="http://schemas.openxmlformats.org/officeDocument/2006/math" xmlns:v="urn:schemas-microsoft-com:vml" xmlns:wp14="http://schemas.microsoft.com/office/word/2010/wordprocessingDrawing" xmlns:wp="http://schemas.openxmlformats.org/drawingml/2006/wordprocessingDrawing" xmlns:w10="urn:schemas-microsoft-com:office:word" xmlns:w="http://schemas.openxmlformats.org/wordprocessingml/2006/main" xmlns:w14="http://schemas.microsoft.com/office/word/2010/wordml" xmlns:w15="http://schemas.microsoft.com/office/word/2012/wordml" xmlns:w16cex="http://schemas.microsoft.com/office/word/2018/wordml/cex" xmlns:w16cid="http://schemas.microsoft.com/office/word/2016/wordml/cid" xmlns:w16="http://schemas.microsoft.com/office/word/2018/wordml" xmlns:w16sdtdh="http://schemas.microsoft.com/office/word/2020/wordml/sdtdatahash" xmlns:w16se="http://schemas.microsoft.com/office/word/2015/wordml/symex" xmlns:wpg="http://schemas.microsoft.com/office/word/2010/wordprocessingGroup" xmlns:wpi="http://schemas.microsoft.com/office/word/2010/wordprocessingInk" xmlns:wne="http://schemas.microsoft.com/office/word/2006/wordml" xmlns:wps="http://schemas.microsoft.com/office/word/2010/wordprocessingShape" mc:Ignorable="w14 w15 w16se w16cid w16 w16cex w16sdtdh wp14">
   <w:body>
     <w:p>
+      <w:proofErr w:type="spellStart"/>
       <w:r>
         <w:t>p</w:t>
       </w:r>
@@ -10,8 +11,17 @@
         <w:t>j</w:t>
       </w:r>
       <w:r>
-        <w:t>_tracoll Documentation</w:t>
+        <w:t>_tracoll</w:t>
       </w:r>
+      <w:proofErr w:type="spellEnd"/>
+      <w:r>
+        <w:t xml:space="preserve"> </w:t>
+      </w:r>
+      <w:proofErr w:type="spellStart"/>
+      <w:r>
+        <w:t>Documentation</w:t>
+      </w:r>
+      <w:proofErr w:type="spellEnd"/>
     </w:p>
     <w:p/>
     <w:p>
@@ -153,9 +163,11 @@
                       <wps:txbx>
                         <w:txbxContent>
                           <w:p>
+                            <w:proofErr w:type="gramStart"/>
                             <w:r>
                               <w:t>0..*</w:t>
                             </w:r>
+                            <w:proofErr w:type="gramEnd"/>
                           </w:p>
                         </w:txbxContent>
                       </wps:txbx>
@@ -183,9 +195,11 @@
                 <v:textbox>
                   <w:txbxContent>
                     <w:p>
+                      <w:proofErr w:type="gramStart"/>
                       <w:r>
                         <w:t>0..*</w:t>
                       </w:r>
+                      <w:proofErr w:type="gramEnd"/>
                     </w:p>
                   </w:txbxContent>
                 </v:textbox>
@@ -238,9 +252,11 @@
                       <wps:txbx>
                         <w:txbxContent>
                           <w:p>
+                            <w:proofErr w:type="gramStart"/>
                             <w:r>
                               <w:t>1..*</w:t>
                             </w:r>
+                            <w:proofErr w:type="gramEnd"/>
                           </w:p>
                         </w:txbxContent>
                       </wps:txbx>
@@ -268,9 +284,11 @@
                 <v:textbox>
                   <w:txbxContent>
                     <w:p>
+                      <w:proofErr w:type="gramStart"/>
                       <w:r>
                         <w:t>1..*</w:t>
                       </w:r>
+                      <w:proofErr w:type="gramEnd"/>
                     </w:p>
                   </w:txbxContent>
                 </v:textbox>
@@ -753,16 +771,29 @@
                                 <w:lang w:val="en-US"/>
                               </w:rPr>
                             </w:pPr>
-                            <w:r>
-                              <w:rPr>
-                                <w:rFonts w:ascii="Cascadia Mono" w:hAnsi="Cascadia Mono" w:cs="Cascadia Mono"/>
-                                <w:kern w:val="0"/>
-                                <w:sz w:val="19"/>
-                                <w:szCs w:val="19"/>
-                                <w:lang w:val="en-US"/>
-                              </w:rPr>
-                              <w:t xml:space="preserve">Translated_title: </w:t>
-                            </w:r>
+                            <w:proofErr w:type="spellStart"/>
+                            <w:r>
+                              <w:rPr>
+                                <w:rFonts w:ascii="Cascadia Mono" w:hAnsi="Cascadia Mono" w:cs="Cascadia Mono"/>
+                                <w:kern w:val="0"/>
+                                <w:sz w:val="19"/>
+                                <w:szCs w:val="19"/>
+                                <w:lang w:val="en-US"/>
+                              </w:rPr>
+                              <w:t>Translated_title</w:t>
+                            </w:r>
+                            <w:proofErr w:type="spellEnd"/>
+                            <w:r>
+                              <w:rPr>
+                                <w:rFonts w:ascii="Cascadia Mono" w:hAnsi="Cascadia Mono" w:cs="Cascadia Mono"/>
+                                <w:kern w:val="0"/>
+                                <w:sz w:val="19"/>
+                                <w:szCs w:val="19"/>
+                                <w:lang w:val="en-US"/>
+                              </w:rPr>
+                              <w:t xml:space="preserve">: </w:t>
+                            </w:r>
+                            <w:proofErr w:type="gramStart"/>
                             <w:r>
                               <w:rPr>
                                 <w:rFonts w:ascii="Cascadia Mono" w:hAnsi="Cascadia Mono" w:cs="Cascadia Mono"/>
@@ -774,6 +805,7 @@
                               </w:rPr>
                               <w:t>String</w:t>
                             </w:r>
+                            <w:proofErr w:type="gramEnd"/>
                           </w:p>
                           <w:p>
                             <w:pPr>
@@ -786,17 +818,43 @@
                                 <w:lang w:val="en-US"/>
                               </w:rPr>
                             </w:pPr>
-                            <w:r>
-                              <w:rPr>
-                                <w:rFonts w:ascii="Cascadia Mono" w:hAnsi="Cascadia Mono" w:cs="Cascadia Mono"/>
-                                <w:color w:val="000000"/>
-                                <w:kern w:val="0"/>
-                                <w:sz w:val="19"/>
-                                <w:szCs w:val="19"/>
-                                <w:lang w:val="en-US"/>
-                              </w:rPr>
-                              <w:t>Translated_content: String</w:t>
-                            </w:r>
+                            <w:proofErr w:type="spellStart"/>
+                            <w:r>
+                              <w:rPr>
+                                <w:rFonts w:ascii="Cascadia Mono" w:hAnsi="Cascadia Mono" w:cs="Cascadia Mono"/>
+                                <w:color w:val="000000"/>
+                                <w:kern w:val="0"/>
+                                <w:sz w:val="19"/>
+                                <w:szCs w:val="19"/>
+                                <w:lang w:val="en-US"/>
+                              </w:rPr>
+                              <w:t>Translated_content</w:t>
+                            </w:r>
+                            <w:proofErr w:type="spellEnd"/>
+                            <w:r>
+                              <w:rPr>
+                                <w:rFonts w:ascii="Cascadia Mono" w:hAnsi="Cascadia Mono" w:cs="Cascadia Mono"/>
+                                <w:color w:val="000000"/>
+                                <w:kern w:val="0"/>
+                                <w:sz w:val="19"/>
+                                <w:szCs w:val="19"/>
+                                <w:lang w:val="en-US"/>
+                              </w:rPr>
+                              <w:t xml:space="preserve">: </w:t>
+                            </w:r>
+                            <w:proofErr w:type="gramStart"/>
+                            <w:r>
+                              <w:rPr>
+                                <w:rFonts w:ascii="Cascadia Mono" w:hAnsi="Cascadia Mono" w:cs="Cascadia Mono"/>
+                                <w:color w:val="000000"/>
+                                <w:kern w:val="0"/>
+                                <w:sz w:val="19"/>
+                                <w:szCs w:val="19"/>
+                                <w:lang w:val="en-US"/>
+                              </w:rPr>
+                              <w:t>String</w:t>
+                            </w:r>
+                            <w:proofErr w:type="gramEnd"/>
                           </w:p>
                           <w:p>
                             <w:pPr>
@@ -809,6 +867,7 @@
                                 <w:lang w:val="en-US"/>
                               </w:rPr>
                             </w:pPr>
+                            <w:proofErr w:type="spellStart"/>
                             <w:r>
                               <w:rPr>
                                 <w:rFonts w:ascii="Cascadia Mono" w:hAnsi="Cascadia Mono" w:cs="Cascadia Mono"/>
@@ -819,6 +878,7 @@
                               </w:rPr>
                               <w:t>Original_text</w:t>
                             </w:r>
+                            <w:proofErr w:type="spellEnd"/>
                             <w:r>
                               <w:rPr>
                                 <w:rFonts w:ascii="Cascadia Mono" w:hAnsi="Cascadia Mono" w:cs="Cascadia Mono"/>
@@ -846,18 +906,31 @@
                                 <w:szCs w:val="19"/>
                                 <w:lang w:val="en-US"/>
                               </w:rPr>
-                              <w:t>Translator / Generator : User</w:t>
-                            </w:r>
-                            <w:r>
-                              <w:rPr>
-                                <w:rFonts w:ascii="Cascadia Mono" w:hAnsi="Cascadia Mono" w:cs="Cascadia Mono"/>
-                                <w:color w:val="000000"/>
-                                <w:kern w:val="0"/>
-                                <w:sz w:val="19"/>
-                                <w:szCs w:val="19"/>
-                                <w:lang w:val="en-US"/>
-                              </w:rPr>
-                              <w:t xml:space="preserve"> ??</w:t>
+                              <w:t xml:space="preserve">Translator / </w:t>
+                            </w:r>
+                            <w:proofErr w:type="gramStart"/>
+                            <w:r>
+                              <w:rPr>
+                                <w:rFonts w:ascii="Cascadia Mono" w:hAnsi="Cascadia Mono" w:cs="Cascadia Mono"/>
+                                <w:color w:val="000000"/>
+                                <w:kern w:val="0"/>
+                                <w:sz w:val="19"/>
+                                <w:szCs w:val="19"/>
+                                <w:lang w:val="en-US"/>
+                              </w:rPr>
+                              <w:t>Generator :</w:t>
+                            </w:r>
+                            <w:proofErr w:type="gramEnd"/>
+                            <w:r>
+                              <w:rPr>
+                                <w:rFonts w:ascii="Cascadia Mono" w:hAnsi="Cascadia Mono" w:cs="Cascadia Mono"/>
+                                <w:color w:val="000000"/>
+                                <w:kern w:val="0"/>
+                                <w:sz w:val="19"/>
+                                <w:szCs w:val="19"/>
+                                <w:lang w:val="en-US"/>
+                              </w:rPr>
+                              <w:t xml:space="preserve"> User</w:t>
                             </w:r>
                           </w:p>
                         </w:txbxContent>
@@ -921,16 +994,29 @@
                           <w:lang w:val="en-US"/>
                         </w:rPr>
                       </w:pPr>
-                      <w:r>
-                        <w:rPr>
-                          <w:rFonts w:ascii="Cascadia Mono" w:hAnsi="Cascadia Mono" w:cs="Cascadia Mono"/>
-                          <w:kern w:val="0"/>
-                          <w:sz w:val="19"/>
-                          <w:szCs w:val="19"/>
-                          <w:lang w:val="en-US"/>
-                        </w:rPr>
-                        <w:t xml:space="preserve">Translated_title: </w:t>
-                      </w:r>
+                      <w:proofErr w:type="spellStart"/>
+                      <w:r>
+                        <w:rPr>
+                          <w:rFonts w:ascii="Cascadia Mono" w:hAnsi="Cascadia Mono" w:cs="Cascadia Mono"/>
+                          <w:kern w:val="0"/>
+                          <w:sz w:val="19"/>
+                          <w:szCs w:val="19"/>
+                          <w:lang w:val="en-US"/>
+                        </w:rPr>
+                        <w:t>Translated_title</w:t>
+                      </w:r>
+                      <w:proofErr w:type="spellEnd"/>
+                      <w:r>
+                        <w:rPr>
+                          <w:rFonts w:ascii="Cascadia Mono" w:hAnsi="Cascadia Mono" w:cs="Cascadia Mono"/>
+                          <w:kern w:val="0"/>
+                          <w:sz w:val="19"/>
+                          <w:szCs w:val="19"/>
+                          <w:lang w:val="en-US"/>
+                        </w:rPr>
+                        <w:t xml:space="preserve">: </w:t>
+                      </w:r>
+                      <w:proofErr w:type="gramStart"/>
                       <w:r>
                         <w:rPr>
                           <w:rFonts w:ascii="Cascadia Mono" w:hAnsi="Cascadia Mono" w:cs="Cascadia Mono"/>
@@ -942,6 +1028,7 @@
                         </w:rPr>
                         <w:t>String</w:t>
                       </w:r>
+                      <w:proofErr w:type="gramEnd"/>
                     </w:p>
                     <w:p>
                       <w:pPr>
@@ -954,17 +1041,43 @@
                           <w:lang w:val="en-US"/>
                         </w:rPr>
                       </w:pPr>
-                      <w:r>
-                        <w:rPr>
-                          <w:rFonts w:ascii="Cascadia Mono" w:hAnsi="Cascadia Mono" w:cs="Cascadia Mono"/>
-                          <w:color w:val="000000"/>
-                          <w:kern w:val="0"/>
-                          <w:sz w:val="19"/>
-                          <w:szCs w:val="19"/>
-                          <w:lang w:val="en-US"/>
-                        </w:rPr>
-                        <w:t>Translated_content: String</w:t>
-                      </w:r>
+                      <w:proofErr w:type="spellStart"/>
+                      <w:r>
+                        <w:rPr>
+                          <w:rFonts w:ascii="Cascadia Mono" w:hAnsi="Cascadia Mono" w:cs="Cascadia Mono"/>
+                          <w:color w:val="000000"/>
+                          <w:kern w:val="0"/>
+                          <w:sz w:val="19"/>
+                          <w:szCs w:val="19"/>
+                          <w:lang w:val="en-US"/>
+                        </w:rPr>
+                        <w:t>Translated_content</w:t>
+                      </w:r>
+                      <w:proofErr w:type="spellEnd"/>
+                      <w:r>
+                        <w:rPr>
+                          <w:rFonts w:ascii="Cascadia Mono" w:hAnsi="Cascadia Mono" w:cs="Cascadia Mono"/>
+                          <w:color w:val="000000"/>
+                          <w:kern w:val="0"/>
+                          <w:sz w:val="19"/>
+                          <w:szCs w:val="19"/>
+                          <w:lang w:val="en-US"/>
+                        </w:rPr>
+                        <w:t xml:space="preserve">: </w:t>
+                      </w:r>
+                      <w:proofErr w:type="gramStart"/>
+                      <w:r>
+                        <w:rPr>
+                          <w:rFonts w:ascii="Cascadia Mono" w:hAnsi="Cascadia Mono" w:cs="Cascadia Mono"/>
+                          <w:color w:val="000000"/>
+                          <w:kern w:val="0"/>
+                          <w:sz w:val="19"/>
+                          <w:szCs w:val="19"/>
+                          <w:lang w:val="en-US"/>
+                        </w:rPr>
+                        <w:t>String</w:t>
+                      </w:r>
+                      <w:proofErr w:type="gramEnd"/>
                     </w:p>
                     <w:p>
                       <w:pPr>
@@ -977,6 +1090,7 @@
                           <w:lang w:val="en-US"/>
                         </w:rPr>
                       </w:pPr>
+                      <w:proofErr w:type="spellStart"/>
                       <w:r>
                         <w:rPr>
                           <w:rFonts w:ascii="Cascadia Mono" w:hAnsi="Cascadia Mono" w:cs="Cascadia Mono"/>
@@ -987,6 +1101,7 @@
                         </w:rPr>
                         <w:t>Original_text</w:t>
                       </w:r>
+                      <w:proofErr w:type="spellEnd"/>
                       <w:r>
                         <w:rPr>
                           <w:rFonts w:ascii="Cascadia Mono" w:hAnsi="Cascadia Mono" w:cs="Cascadia Mono"/>
@@ -1014,18 +1129,31 @@
                           <w:szCs w:val="19"/>
                           <w:lang w:val="en-US"/>
                         </w:rPr>
-                        <w:t>Translator / Generator : User</w:t>
-                      </w:r>
-                      <w:r>
-                        <w:rPr>
-                          <w:rFonts w:ascii="Cascadia Mono" w:hAnsi="Cascadia Mono" w:cs="Cascadia Mono"/>
-                          <w:color w:val="000000"/>
-                          <w:kern w:val="0"/>
-                          <w:sz w:val="19"/>
-                          <w:szCs w:val="19"/>
-                          <w:lang w:val="en-US"/>
-                        </w:rPr>
-                        <w:t xml:space="preserve"> ??</w:t>
+                        <w:t xml:space="preserve">Translator / </w:t>
+                      </w:r>
+                      <w:proofErr w:type="gramStart"/>
+                      <w:r>
+                        <w:rPr>
+                          <w:rFonts w:ascii="Cascadia Mono" w:hAnsi="Cascadia Mono" w:cs="Cascadia Mono"/>
+                          <w:color w:val="000000"/>
+                          <w:kern w:val="0"/>
+                          <w:sz w:val="19"/>
+                          <w:szCs w:val="19"/>
+                          <w:lang w:val="en-US"/>
+                        </w:rPr>
+                        <w:t>Generator :</w:t>
+                      </w:r>
+                      <w:proofErr w:type="gramEnd"/>
+                      <w:r>
+                        <w:rPr>
+                          <w:rFonts w:ascii="Cascadia Mono" w:hAnsi="Cascadia Mono" w:cs="Cascadia Mono"/>
+                          <w:color w:val="000000"/>
+                          <w:kern w:val="0"/>
+                          <w:sz w:val="19"/>
+                          <w:szCs w:val="19"/>
+                          <w:lang w:val="en-US"/>
+                        </w:rPr>
+                        <w:t xml:space="preserve"> User</w:t>
                       </w:r>
                     </w:p>
                   </w:txbxContent>
@@ -1132,6 +1260,7 @@
                                 <w:lang w:val="en-US"/>
                               </w:rPr>
                             </w:pPr>
+                            <w:proofErr w:type="spellStart"/>
                             <w:r>
                               <w:rPr>
                                 <w:rFonts w:ascii="Cascadia Mono" w:hAnsi="Cascadia Mono" w:cs="Cascadia Mono"/>
@@ -1152,7 +1281,43 @@
                                 <w:szCs w:val="19"/>
                                 <w:lang w:val="en-US"/>
                               </w:rPr>
-                              <w:t>ype_of_text : String</w:t>
+                              <w:t>ype_of_</w:t>
+                            </w:r>
+                            <w:proofErr w:type="gramStart"/>
+                            <w:r>
+                              <w:rPr>
+                                <w:rFonts w:ascii="Cascadia Mono" w:hAnsi="Cascadia Mono" w:cs="Cascadia Mono"/>
+                                <w:color w:val="000000"/>
+                                <w:kern w:val="0"/>
+                                <w:sz w:val="19"/>
+                                <w:szCs w:val="19"/>
+                                <w:lang w:val="en-US"/>
+                              </w:rPr>
+                              <w:t>text</w:t>
+                            </w:r>
+                            <w:proofErr w:type="spellEnd"/>
+                            <w:r>
+                              <w:rPr>
+                                <w:rFonts w:ascii="Cascadia Mono" w:hAnsi="Cascadia Mono" w:cs="Cascadia Mono"/>
+                                <w:color w:val="000000"/>
+                                <w:kern w:val="0"/>
+                                <w:sz w:val="19"/>
+                                <w:szCs w:val="19"/>
+                                <w:lang w:val="en-US"/>
+                              </w:rPr>
+                              <w:t xml:space="preserve"> :</w:t>
+                            </w:r>
+                            <w:proofErr w:type="gramEnd"/>
+                            <w:r>
+                              <w:rPr>
+                                <w:rFonts w:ascii="Cascadia Mono" w:hAnsi="Cascadia Mono" w:cs="Cascadia Mono"/>
+                                <w:color w:val="000000"/>
+                                <w:kern w:val="0"/>
+                                <w:sz w:val="19"/>
+                                <w:szCs w:val="19"/>
+                                <w:lang w:val="en-US"/>
+                              </w:rPr>
+                              <w:t xml:space="preserve"> String</w:t>
                             </w:r>
                           </w:p>
                           <w:p>
@@ -1243,6 +1408,7 @@
                                 <w:lang w:val="en-US"/>
                               </w:rPr>
                             </w:pPr>
+                            <w:proofErr w:type="spellStart"/>
                             <w:r>
                               <w:rPr>
                                 <w:rFonts w:ascii="Cascadia Mono" w:hAnsi="Cascadia Mono" w:cs="Cascadia Mono"/>
@@ -1263,7 +1429,19 @@
                                 <w:szCs w:val="19"/>
                                 <w:lang w:val="en-US"/>
                               </w:rPr>
-                              <w:t>riginal_language: String</w:t>
+                              <w:t>riginal_language</w:t>
+                            </w:r>
+                            <w:proofErr w:type="spellEnd"/>
+                            <w:r>
+                              <w:rPr>
+                                <w:rFonts w:ascii="Cascadia Mono" w:hAnsi="Cascadia Mono" w:cs="Cascadia Mono"/>
+                                <w:color w:val="000000"/>
+                                <w:kern w:val="0"/>
+                                <w:sz w:val="19"/>
+                                <w:szCs w:val="19"/>
+                                <w:lang w:val="en-US"/>
+                              </w:rPr>
+                              <w:t>: String</w:t>
                             </w:r>
                           </w:p>
                           <w:p>
@@ -1277,6 +1455,7 @@
                                 <w:lang w:val="en-US"/>
                               </w:rPr>
                             </w:pPr>
+                            <w:proofErr w:type="gramStart"/>
                             <w:r>
                               <w:rPr>
                                 <w:rFonts w:ascii="Cascadia Mono" w:hAnsi="Cascadia Mono" w:cs="Cascadia Mono"/>
@@ -1297,7 +1476,19 @@
                                 <w:szCs w:val="19"/>
                                 <w:lang w:val="en-US"/>
                               </w:rPr>
-                              <w:t>uthor : Author</w:t>
+                              <w:t>uthor :</w:t>
+                            </w:r>
+                            <w:proofErr w:type="gramEnd"/>
+                            <w:r>
+                              <w:rPr>
+                                <w:rFonts w:ascii="Cascadia Mono" w:hAnsi="Cascadia Mono" w:cs="Cascadia Mono"/>
+                                <w:color w:val="000000"/>
+                                <w:kern w:val="0"/>
+                                <w:sz w:val="19"/>
+                                <w:szCs w:val="19"/>
+                                <w:lang w:val="en-US"/>
+                              </w:rPr>
+                              <w:t xml:space="preserve"> Author</w:t>
                             </w:r>
                           </w:p>
                           <w:p>
@@ -1311,6 +1502,7 @@
                                 <w:lang w:val="en-US"/>
                               </w:rPr>
                             </w:pPr>
+                            <w:proofErr w:type="spellStart"/>
                             <w:r>
                               <w:rPr>
                                 <w:rFonts w:ascii="Cascadia Mono" w:hAnsi="Cascadia Mono" w:cs="Cascadia Mono"/>
@@ -1331,7 +1523,19 @@
                                 <w:szCs w:val="19"/>
                                 <w:lang w:val="en-US"/>
                               </w:rPr>
-                              <w:t>tatus_of_translation: STATUS</w:t>
+                              <w:t>tatus_of_translation</w:t>
+                            </w:r>
+                            <w:proofErr w:type="spellEnd"/>
+                            <w:r>
+                              <w:rPr>
+                                <w:rFonts w:ascii="Cascadia Mono" w:hAnsi="Cascadia Mono" w:cs="Cascadia Mono"/>
+                                <w:color w:val="000000"/>
+                                <w:kern w:val="0"/>
+                                <w:sz w:val="19"/>
+                                <w:szCs w:val="19"/>
+                                <w:lang w:val="en-US"/>
+                              </w:rPr>
+                              <w:t>: STATUS</w:t>
                             </w:r>
                           </w:p>
                           <w:p>
@@ -1403,6 +1607,7 @@
                           <w:lang w:val="en-US"/>
                         </w:rPr>
                       </w:pPr>
+                      <w:proofErr w:type="spellStart"/>
                       <w:r>
                         <w:rPr>
                           <w:rFonts w:ascii="Cascadia Mono" w:hAnsi="Cascadia Mono" w:cs="Cascadia Mono"/>
@@ -1423,7 +1628,43 @@
                           <w:szCs w:val="19"/>
                           <w:lang w:val="en-US"/>
                         </w:rPr>
-                        <w:t>ype_of_text : String</w:t>
+                        <w:t>ype_of_</w:t>
+                      </w:r>
+                      <w:proofErr w:type="gramStart"/>
+                      <w:r>
+                        <w:rPr>
+                          <w:rFonts w:ascii="Cascadia Mono" w:hAnsi="Cascadia Mono" w:cs="Cascadia Mono"/>
+                          <w:color w:val="000000"/>
+                          <w:kern w:val="0"/>
+                          <w:sz w:val="19"/>
+                          <w:szCs w:val="19"/>
+                          <w:lang w:val="en-US"/>
+                        </w:rPr>
+                        <w:t>text</w:t>
+                      </w:r>
+                      <w:proofErr w:type="spellEnd"/>
+                      <w:r>
+                        <w:rPr>
+                          <w:rFonts w:ascii="Cascadia Mono" w:hAnsi="Cascadia Mono" w:cs="Cascadia Mono"/>
+                          <w:color w:val="000000"/>
+                          <w:kern w:val="0"/>
+                          <w:sz w:val="19"/>
+                          <w:szCs w:val="19"/>
+                          <w:lang w:val="en-US"/>
+                        </w:rPr>
+                        <w:t xml:space="preserve"> :</w:t>
+                      </w:r>
+                      <w:proofErr w:type="gramEnd"/>
+                      <w:r>
+                        <w:rPr>
+                          <w:rFonts w:ascii="Cascadia Mono" w:hAnsi="Cascadia Mono" w:cs="Cascadia Mono"/>
+                          <w:color w:val="000000"/>
+                          <w:kern w:val="0"/>
+                          <w:sz w:val="19"/>
+                          <w:szCs w:val="19"/>
+                          <w:lang w:val="en-US"/>
+                        </w:rPr>
+                        <w:t xml:space="preserve"> String</w:t>
                       </w:r>
                     </w:p>
                     <w:p>
@@ -1514,6 +1755,7 @@
                           <w:lang w:val="en-US"/>
                         </w:rPr>
                       </w:pPr>
+                      <w:proofErr w:type="spellStart"/>
                       <w:r>
                         <w:rPr>
                           <w:rFonts w:ascii="Cascadia Mono" w:hAnsi="Cascadia Mono" w:cs="Cascadia Mono"/>
@@ -1534,7 +1776,19 @@
                           <w:szCs w:val="19"/>
                           <w:lang w:val="en-US"/>
                         </w:rPr>
-                        <w:t>riginal_language: String</w:t>
+                        <w:t>riginal_language</w:t>
+                      </w:r>
+                      <w:proofErr w:type="spellEnd"/>
+                      <w:r>
+                        <w:rPr>
+                          <w:rFonts w:ascii="Cascadia Mono" w:hAnsi="Cascadia Mono" w:cs="Cascadia Mono"/>
+                          <w:color w:val="000000"/>
+                          <w:kern w:val="0"/>
+                          <w:sz w:val="19"/>
+                          <w:szCs w:val="19"/>
+                          <w:lang w:val="en-US"/>
+                        </w:rPr>
+                        <w:t>: String</w:t>
                       </w:r>
                     </w:p>
                     <w:p>
@@ -1548,6 +1802,7 @@
                           <w:lang w:val="en-US"/>
                         </w:rPr>
                       </w:pPr>
+                      <w:proofErr w:type="gramStart"/>
                       <w:r>
                         <w:rPr>
                           <w:rFonts w:ascii="Cascadia Mono" w:hAnsi="Cascadia Mono" w:cs="Cascadia Mono"/>
@@ -1568,7 +1823,19 @@
                           <w:szCs w:val="19"/>
                           <w:lang w:val="en-US"/>
                         </w:rPr>
-                        <w:t>uthor : Author</w:t>
+                        <w:t>uthor :</w:t>
+                      </w:r>
+                      <w:proofErr w:type="gramEnd"/>
+                      <w:r>
+                        <w:rPr>
+                          <w:rFonts w:ascii="Cascadia Mono" w:hAnsi="Cascadia Mono" w:cs="Cascadia Mono"/>
+                          <w:color w:val="000000"/>
+                          <w:kern w:val="0"/>
+                          <w:sz w:val="19"/>
+                          <w:szCs w:val="19"/>
+                          <w:lang w:val="en-US"/>
+                        </w:rPr>
+                        <w:t xml:space="preserve"> Author</w:t>
                       </w:r>
                     </w:p>
                     <w:p>
@@ -1582,6 +1849,7 @@
                           <w:lang w:val="en-US"/>
                         </w:rPr>
                       </w:pPr>
+                      <w:proofErr w:type="spellStart"/>
                       <w:r>
                         <w:rPr>
                           <w:rFonts w:ascii="Cascadia Mono" w:hAnsi="Cascadia Mono" w:cs="Cascadia Mono"/>
@@ -1602,7 +1870,19 @@
                           <w:szCs w:val="19"/>
                           <w:lang w:val="en-US"/>
                         </w:rPr>
-                        <w:t>tatus_of_translation: STATUS</w:t>
+                        <w:t>tatus_of_translation</w:t>
+                      </w:r>
+                      <w:proofErr w:type="spellEnd"/>
+                      <w:r>
+                        <w:rPr>
+                          <w:rFonts w:ascii="Cascadia Mono" w:hAnsi="Cascadia Mono" w:cs="Cascadia Mono"/>
+                          <w:color w:val="000000"/>
+                          <w:kern w:val="0"/>
+                          <w:sz w:val="19"/>
+                          <w:szCs w:val="19"/>
+                          <w:lang w:val="en-US"/>
+                        </w:rPr>
+                        <w:t>: STATUS</w:t>
                       </w:r>
                     </w:p>
                     <w:p>
@@ -1717,16 +1997,53 @@
                                 <w:lang w:val="en-US"/>
                               </w:rPr>
                             </w:pPr>
-                            <w:r>
-                              <w:rPr>
-                                <w:rFonts w:ascii="Cascadia Mono" w:hAnsi="Cascadia Mono" w:cs="Cascadia Mono"/>
-                                <w:color w:val="000000"/>
-                                <w:kern w:val="0"/>
-                                <w:sz w:val="19"/>
-                                <w:szCs w:val="19"/>
-                                <w:lang w:val="en-US"/>
-                              </w:rPr>
-                              <w:t>Type_of_author : STATUS</w:t>
+                            <w:proofErr w:type="spellStart"/>
+                            <w:r>
+                              <w:rPr>
+                                <w:rFonts w:ascii="Cascadia Mono" w:hAnsi="Cascadia Mono" w:cs="Cascadia Mono"/>
+                                <w:color w:val="000000"/>
+                                <w:kern w:val="0"/>
+                                <w:sz w:val="19"/>
+                                <w:szCs w:val="19"/>
+                                <w:lang w:val="en-US"/>
+                              </w:rPr>
+                              <w:t>Type_of_</w:t>
+                            </w:r>
+                            <w:proofErr w:type="gramStart"/>
+                            <w:r>
+                              <w:rPr>
+                                <w:rFonts w:ascii="Cascadia Mono" w:hAnsi="Cascadia Mono" w:cs="Cascadia Mono"/>
+                                <w:color w:val="000000"/>
+                                <w:kern w:val="0"/>
+                                <w:sz w:val="19"/>
+                                <w:szCs w:val="19"/>
+                                <w:lang w:val="en-US"/>
+                              </w:rPr>
+                              <w:t>author</w:t>
+                            </w:r>
+                            <w:proofErr w:type="spellEnd"/>
+                            <w:r>
+                              <w:rPr>
+                                <w:rFonts w:ascii="Cascadia Mono" w:hAnsi="Cascadia Mono" w:cs="Cascadia Mono"/>
+                                <w:color w:val="000000"/>
+                                <w:kern w:val="0"/>
+                                <w:sz w:val="19"/>
+                                <w:szCs w:val="19"/>
+                                <w:lang w:val="en-US"/>
+                              </w:rPr>
+                              <w:t xml:space="preserve"> :</w:t>
+                            </w:r>
+                            <w:proofErr w:type="gramEnd"/>
+                            <w:r>
+                              <w:rPr>
+                                <w:rFonts w:ascii="Cascadia Mono" w:hAnsi="Cascadia Mono" w:cs="Cascadia Mono"/>
+                                <w:color w:val="000000"/>
+                                <w:kern w:val="0"/>
+                                <w:sz w:val="19"/>
+                                <w:szCs w:val="19"/>
+                                <w:lang w:val="en-US"/>
+                              </w:rPr>
+                              <w:t xml:space="preserve"> STATUS</w:t>
                             </w:r>
                           </w:p>
                           <w:p>
@@ -1740,26 +2057,61 @@
                                 <w:lang w:val="en-US"/>
                               </w:rPr>
                             </w:pPr>
-                            <w:r>
-                              <w:rPr>
-                                <w:rFonts w:ascii="Cascadia Mono" w:hAnsi="Cascadia Mono" w:cs="Cascadia Mono"/>
-                                <w:kern w:val="0"/>
-                                <w:sz w:val="19"/>
-                                <w:szCs w:val="19"/>
-                                <w:lang w:val="en-US"/>
-                              </w:rPr>
-                              <w:t xml:space="preserve">Name_of_author </w:t>
-                            </w:r>
-                            <w:r>
-                              <w:rPr>
-                                <w:rFonts w:ascii="Cascadia Mono" w:hAnsi="Cascadia Mono" w:cs="Cascadia Mono"/>
-                                <w:color w:val="000000"/>
-                                <w:kern w:val="0"/>
-                                <w:sz w:val="19"/>
-                                <w:szCs w:val="19"/>
-                                <w:lang w:val="en-US"/>
-                              </w:rPr>
-                              <w:t>: String</w:t>
+                            <w:proofErr w:type="spellStart"/>
+                            <w:r>
+                              <w:rPr>
+                                <w:rFonts w:ascii="Cascadia Mono" w:hAnsi="Cascadia Mono" w:cs="Cascadia Mono"/>
+                                <w:kern w:val="0"/>
+                                <w:sz w:val="19"/>
+                                <w:szCs w:val="19"/>
+                                <w:lang w:val="en-US"/>
+                              </w:rPr>
+                              <w:t>Name_of_</w:t>
+                            </w:r>
+                            <w:proofErr w:type="gramStart"/>
+                            <w:r>
+                              <w:rPr>
+                                <w:rFonts w:ascii="Cascadia Mono" w:hAnsi="Cascadia Mono" w:cs="Cascadia Mono"/>
+                                <w:kern w:val="0"/>
+                                <w:sz w:val="19"/>
+                                <w:szCs w:val="19"/>
+                                <w:lang w:val="en-US"/>
+                              </w:rPr>
+                              <w:t>author</w:t>
+                            </w:r>
+                            <w:proofErr w:type="spellEnd"/>
+                            <w:r>
+                              <w:rPr>
+                                <w:rFonts w:ascii="Cascadia Mono" w:hAnsi="Cascadia Mono" w:cs="Cascadia Mono"/>
+                                <w:kern w:val="0"/>
+                                <w:sz w:val="19"/>
+                                <w:szCs w:val="19"/>
+                                <w:lang w:val="en-US"/>
+                              </w:rPr>
+                              <w:t xml:space="preserve"> </w:t>
+                            </w:r>
+                            <w:r>
+                              <w:rPr>
+                                <w:rFonts w:ascii="Cascadia Mono" w:hAnsi="Cascadia Mono" w:cs="Cascadia Mono"/>
+                                <w:color w:val="000000"/>
+                                <w:kern w:val="0"/>
+                                <w:sz w:val="19"/>
+                                <w:szCs w:val="19"/>
+                                <w:lang w:val="en-US"/>
+                              </w:rPr>
+                              <w:t>:</w:t>
+                            </w:r>
+                            <w:proofErr w:type="gramEnd"/>
+                            <w:r>
+                              <w:rPr>
+                                <w:rFonts w:ascii="Cascadia Mono" w:hAnsi="Cascadia Mono" w:cs="Cascadia Mono"/>
+                                <w:color w:val="000000"/>
+                                <w:kern w:val="0"/>
+                                <w:sz w:val="19"/>
+                                <w:szCs w:val="19"/>
+                                <w:lang w:val="en-US"/>
+                              </w:rPr>
+                              <w:t xml:space="preserve"> String</w:t>
                             </w:r>
                           </w:p>
                           <w:p>
@@ -1831,16 +2183,53 @@
                           <w:lang w:val="en-US"/>
                         </w:rPr>
                       </w:pPr>
-                      <w:r>
-                        <w:rPr>
-                          <w:rFonts w:ascii="Cascadia Mono" w:hAnsi="Cascadia Mono" w:cs="Cascadia Mono"/>
-                          <w:color w:val="000000"/>
-                          <w:kern w:val="0"/>
-                          <w:sz w:val="19"/>
-                          <w:szCs w:val="19"/>
-                          <w:lang w:val="en-US"/>
-                        </w:rPr>
-                        <w:t>Type_of_author : STATUS</w:t>
+                      <w:proofErr w:type="spellStart"/>
+                      <w:r>
+                        <w:rPr>
+                          <w:rFonts w:ascii="Cascadia Mono" w:hAnsi="Cascadia Mono" w:cs="Cascadia Mono"/>
+                          <w:color w:val="000000"/>
+                          <w:kern w:val="0"/>
+                          <w:sz w:val="19"/>
+                          <w:szCs w:val="19"/>
+                          <w:lang w:val="en-US"/>
+                        </w:rPr>
+                        <w:t>Type_of_</w:t>
+                      </w:r>
+                      <w:proofErr w:type="gramStart"/>
+                      <w:r>
+                        <w:rPr>
+                          <w:rFonts w:ascii="Cascadia Mono" w:hAnsi="Cascadia Mono" w:cs="Cascadia Mono"/>
+                          <w:color w:val="000000"/>
+                          <w:kern w:val="0"/>
+                          <w:sz w:val="19"/>
+                          <w:szCs w:val="19"/>
+                          <w:lang w:val="en-US"/>
+                        </w:rPr>
+                        <w:t>author</w:t>
+                      </w:r>
+                      <w:proofErr w:type="spellEnd"/>
+                      <w:r>
+                        <w:rPr>
+                          <w:rFonts w:ascii="Cascadia Mono" w:hAnsi="Cascadia Mono" w:cs="Cascadia Mono"/>
+                          <w:color w:val="000000"/>
+                          <w:kern w:val="0"/>
+                          <w:sz w:val="19"/>
+                          <w:szCs w:val="19"/>
+                          <w:lang w:val="en-US"/>
+                        </w:rPr>
+                        <w:t xml:space="preserve"> :</w:t>
+                      </w:r>
+                      <w:proofErr w:type="gramEnd"/>
+                      <w:r>
+                        <w:rPr>
+                          <w:rFonts w:ascii="Cascadia Mono" w:hAnsi="Cascadia Mono" w:cs="Cascadia Mono"/>
+                          <w:color w:val="000000"/>
+                          <w:kern w:val="0"/>
+                          <w:sz w:val="19"/>
+                          <w:szCs w:val="19"/>
+                          <w:lang w:val="en-US"/>
+                        </w:rPr>
+                        <w:t xml:space="preserve"> STATUS</w:t>
                       </w:r>
                     </w:p>
                     <w:p>
@@ -1854,26 +2243,61 @@
                           <w:lang w:val="en-US"/>
                         </w:rPr>
                       </w:pPr>
-                      <w:r>
-                        <w:rPr>
-                          <w:rFonts w:ascii="Cascadia Mono" w:hAnsi="Cascadia Mono" w:cs="Cascadia Mono"/>
-                          <w:kern w:val="0"/>
-                          <w:sz w:val="19"/>
-                          <w:szCs w:val="19"/>
-                          <w:lang w:val="en-US"/>
-                        </w:rPr>
-                        <w:t xml:space="preserve">Name_of_author </w:t>
-                      </w:r>
-                      <w:r>
-                        <w:rPr>
-                          <w:rFonts w:ascii="Cascadia Mono" w:hAnsi="Cascadia Mono" w:cs="Cascadia Mono"/>
-                          <w:color w:val="000000"/>
-                          <w:kern w:val="0"/>
-                          <w:sz w:val="19"/>
-                          <w:szCs w:val="19"/>
-                          <w:lang w:val="en-US"/>
-                        </w:rPr>
-                        <w:t>: String</w:t>
+                      <w:proofErr w:type="spellStart"/>
+                      <w:r>
+                        <w:rPr>
+                          <w:rFonts w:ascii="Cascadia Mono" w:hAnsi="Cascadia Mono" w:cs="Cascadia Mono"/>
+                          <w:kern w:val="0"/>
+                          <w:sz w:val="19"/>
+                          <w:szCs w:val="19"/>
+                          <w:lang w:val="en-US"/>
+                        </w:rPr>
+                        <w:t>Name_of_</w:t>
+                      </w:r>
+                      <w:proofErr w:type="gramStart"/>
+                      <w:r>
+                        <w:rPr>
+                          <w:rFonts w:ascii="Cascadia Mono" w:hAnsi="Cascadia Mono" w:cs="Cascadia Mono"/>
+                          <w:kern w:val="0"/>
+                          <w:sz w:val="19"/>
+                          <w:szCs w:val="19"/>
+                          <w:lang w:val="en-US"/>
+                        </w:rPr>
+                        <w:t>author</w:t>
+                      </w:r>
+                      <w:proofErr w:type="spellEnd"/>
+                      <w:r>
+                        <w:rPr>
+                          <w:rFonts w:ascii="Cascadia Mono" w:hAnsi="Cascadia Mono" w:cs="Cascadia Mono"/>
+                          <w:kern w:val="0"/>
+                          <w:sz w:val="19"/>
+                          <w:szCs w:val="19"/>
+                          <w:lang w:val="en-US"/>
+                        </w:rPr>
+                        <w:t xml:space="preserve"> </w:t>
+                      </w:r>
+                      <w:r>
+                        <w:rPr>
+                          <w:rFonts w:ascii="Cascadia Mono" w:hAnsi="Cascadia Mono" w:cs="Cascadia Mono"/>
+                          <w:color w:val="000000"/>
+                          <w:kern w:val="0"/>
+                          <w:sz w:val="19"/>
+                          <w:szCs w:val="19"/>
+                          <w:lang w:val="en-US"/>
+                        </w:rPr>
+                        <w:t>:</w:t>
+                      </w:r>
+                      <w:proofErr w:type="gramEnd"/>
+                      <w:r>
+                        <w:rPr>
+                          <w:rFonts w:ascii="Cascadia Mono" w:hAnsi="Cascadia Mono" w:cs="Cascadia Mono"/>
+                          <w:color w:val="000000"/>
+                          <w:kern w:val="0"/>
+                          <w:sz w:val="19"/>
+                          <w:szCs w:val="19"/>
+                          <w:lang w:val="en-US"/>
+                        </w:rPr>
+                        <w:t xml:space="preserve"> String</w:t>
                       </w:r>
                     </w:p>
                     <w:p>
@@ -1893,7 +2317,15 @@
         </mc:AlternateContent>
       </w:r>
       <w:r>
-        <w:t>E-R Diagram:</w:t>
+        <w:t xml:space="preserve">E-R </w:t>
+      </w:r>
+      <w:proofErr w:type="spellStart"/>
+      <w:r>
+        <w:t>Diagram</w:t>
+      </w:r>
+      <w:proofErr w:type="spellEnd"/>
+      <w:r>
+        <w:t>:</w:t>
       </w:r>
       <w:r>
         <w:rPr>

</xml_diff>

<commit_message>
Translation / Author ListView and DetailView completed.
MAYBE FIX with object.fllter in TranslationList
</commit_message>
<xml_diff>
--- a/documentation.docx
+++ b/documentation.docx
@@ -163,11 +163,12 @@
                       <wps:txbx>
                         <w:txbxContent>
                           <w:p>
-                            <w:proofErr w:type="gramStart"/>
-                            <w:r>
-                              <w:t>0..*</w:t>
-                            </w:r>
-                            <w:proofErr w:type="gramEnd"/>
+                            <w:r>
+                              <w:t>0..</w:t>
+                            </w:r>
+                            <w:r>
+                              <w:t>1</w:t>
+                            </w:r>
                           </w:p>
                         </w:txbxContent>
                       </wps:txbx>
@@ -195,11 +196,12 @@
                 <v:textbox>
                   <w:txbxContent>
                     <w:p>
-                      <w:proofErr w:type="gramStart"/>
-                      <w:r>
-                        <w:t>0..*</w:t>
-                      </w:r>
-                      <w:proofErr w:type="gramEnd"/>
+                      <w:r>
+                        <w:t>0..</w:t>
+                      </w:r>
+                      <w:r>
+                        <w:t>1</w:t>
+                      </w:r>
                     </w:p>
                   </w:txbxContent>
                 </v:textbox>
@@ -860,7 +862,7 @@
                             <w:pPr>
                               <w:rPr>
                                 <w:rFonts w:ascii="Cascadia Mono" w:hAnsi="Cascadia Mono" w:cs="Cascadia Mono"/>
-                                <w:color w:val="000000"/>
+                                <w:color w:val="FF0000"/>
                                 <w:kern w:val="0"/>
                                 <w:sz w:val="19"/>
                                 <w:szCs w:val="19"/>
@@ -888,8 +890,21 @@
                                 <w:szCs w:val="19"/>
                                 <w:lang w:val="en-US"/>
                               </w:rPr>
-                              <w:t>: String</w:t>
-                            </w:r>
+                              <w:t xml:space="preserve">: </w:t>
+                            </w:r>
+                            <w:proofErr w:type="gramStart"/>
+                            <w:r>
+                              <w:rPr>
+                                <w:rFonts w:ascii="Cascadia Mono" w:hAnsi="Cascadia Mono" w:cs="Cascadia Mono"/>
+                                <w:color w:val="FF0000"/>
+                                <w:kern w:val="0"/>
+                                <w:sz w:val="19"/>
+                                <w:szCs w:val="19"/>
+                                <w:lang w:val="en-US"/>
+                              </w:rPr>
+                              <w:t>Text ???</w:t>
+                            </w:r>
+                            <w:proofErr w:type="gramEnd"/>
                           </w:p>
                           <w:p>
                             <w:pPr>
@@ -1083,7 +1098,7 @@
                       <w:pPr>
                         <w:rPr>
                           <w:rFonts w:ascii="Cascadia Mono" w:hAnsi="Cascadia Mono" w:cs="Cascadia Mono"/>
-                          <w:color w:val="000000"/>
+                          <w:color w:val="FF0000"/>
                           <w:kern w:val="0"/>
                           <w:sz w:val="19"/>
                           <w:szCs w:val="19"/>
@@ -1111,8 +1126,21 @@
                           <w:szCs w:val="19"/>
                           <w:lang w:val="en-US"/>
                         </w:rPr>
-                        <w:t>: String</w:t>
-                      </w:r>
+                        <w:t xml:space="preserve">: </w:t>
+                      </w:r>
+                      <w:proofErr w:type="gramStart"/>
+                      <w:r>
+                        <w:rPr>
+                          <w:rFonts w:ascii="Cascadia Mono" w:hAnsi="Cascadia Mono" w:cs="Cascadia Mono"/>
+                          <w:color w:val="FF0000"/>
+                          <w:kern w:val="0"/>
+                          <w:sz w:val="19"/>
+                          <w:szCs w:val="19"/>
+                          <w:lang w:val="en-US"/>
+                        </w:rPr>
+                        <w:t>Text ???</w:t>
+                      </w:r>
+                      <w:proofErr w:type="gramEnd"/>
                     </w:p>
                     <w:p>
                       <w:pPr>
@@ -2334,134 +2362,7 @@
         <w:t xml:space="preserve"> </w:t>
       </w:r>
     </w:p>
-    <w:p>
-      <w:r>
-        <w:rPr>
-          <w:noProof/>
-        </w:rPr>
-        <mc:AlternateContent>
-          <mc:Choice Requires="wps">
-            <w:drawing>
-              <wp:anchor distT="0" distB="0" distL="114300" distR="114300" simplePos="0" relativeHeight="251677696" behindDoc="0" locked="0" layoutInCell="1" allowOverlap="1" wp14:anchorId="7EADE716" wp14:editId="708739D0">
-                <wp:simplePos x="0" y="0"/>
-                <wp:positionH relativeFrom="column">
-                  <wp:posOffset>152400</wp:posOffset>
-                </wp:positionH>
-                <wp:positionV relativeFrom="paragraph">
-                  <wp:posOffset>151765</wp:posOffset>
-                </wp:positionV>
-                <wp:extent cx="0" cy="1303020"/>
-                <wp:effectExtent l="0" t="0" r="38100" b="30480"/>
-                <wp:wrapNone/>
-                <wp:docPr id="2071188317" name="Connettore diritto 6"/>
-                <wp:cNvGraphicFramePr/>
-                <a:graphic xmlns:a="http://schemas.openxmlformats.org/drawingml/2006/main">
-                  <a:graphicData uri="http://schemas.microsoft.com/office/word/2010/wordprocessingShape">
-                    <wps:wsp>
-                      <wps:cNvCnPr/>
-                      <wps:spPr>
-                        <a:xfrm>
-                          <a:off x="0" y="0"/>
-                          <a:ext cx="0" cy="1303020"/>
-                        </a:xfrm>
-                        <a:prstGeom prst="line">
-                          <a:avLst/>
-                        </a:prstGeom>
-                      </wps:spPr>
-                      <wps:style>
-                        <a:lnRef idx="1">
-                          <a:schemeClr val="accent1"/>
-                        </a:lnRef>
-                        <a:fillRef idx="0">
-                          <a:schemeClr val="accent1"/>
-                        </a:fillRef>
-                        <a:effectRef idx="0">
-                          <a:schemeClr val="accent1"/>
-                        </a:effectRef>
-                        <a:fontRef idx="minor">
-                          <a:schemeClr val="tx1"/>
-                        </a:fontRef>
-                      </wps:style>
-                      <wps:bodyPr/>
-                    </wps:wsp>
-                  </a:graphicData>
-                </a:graphic>
-              </wp:anchor>
-            </w:drawing>
-          </mc:Choice>
-          <mc:Fallback>
-            <w:pict>
-              <v:line w14:anchorId="192A7595" id="Connettore diritto 6" o:spid="_x0000_s1026" style="position:absolute;z-index:251677696;visibility:visible;mso-wrap-style:square;mso-wrap-distance-left:9pt;mso-wrap-distance-top:0;mso-wrap-distance-right:9pt;mso-wrap-distance-bottom:0;mso-position-horizontal:absolute;mso-position-horizontal-relative:text;mso-position-vertical:absolute;mso-position-vertical-relative:text" from="12pt,11.95pt" to="12pt,114.55pt" o:gfxdata="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" strokecolor="#4472c4 [3204]" strokeweight=".5pt">
-                <v:stroke joinstyle="miter"/>
-              </v:line>
-            </w:pict>
-          </mc:Fallback>
-        </mc:AlternateContent>
-      </w:r>
-      <w:r>
-        <w:rPr>
-          <w:noProof/>
-        </w:rPr>
-        <mc:AlternateContent>
-          <mc:Choice Requires="wps">
-            <w:drawing>
-              <wp:anchor distT="0" distB="0" distL="114300" distR="114300" simplePos="0" relativeHeight="251674624" behindDoc="0" locked="0" layoutInCell="1" allowOverlap="1" wp14:anchorId="113C9EB6" wp14:editId="5DA1546D">
-                <wp:simplePos x="0" y="0"/>
-                <wp:positionH relativeFrom="column">
-                  <wp:posOffset>0</wp:posOffset>
-                </wp:positionH>
-                <wp:positionV relativeFrom="paragraph">
-                  <wp:posOffset>-635</wp:posOffset>
-                </wp:positionV>
-                <wp:extent cx="0" cy="1303020"/>
-                <wp:effectExtent l="0" t="0" r="38100" b="30480"/>
-                <wp:wrapNone/>
-                <wp:docPr id="1141184723" name="Connettore diritto 6"/>
-                <wp:cNvGraphicFramePr/>
-                <a:graphic xmlns:a="http://schemas.openxmlformats.org/drawingml/2006/main">
-                  <a:graphicData uri="http://schemas.microsoft.com/office/word/2010/wordprocessingShape">
-                    <wps:wsp>
-                      <wps:cNvCnPr/>
-                      <wps:spPr>
-                        <a:xfrm>
-                          <a:off x="0" y="0"/>
-                          <a:ext cx="0" cy="1303020"/>
-                        </a:xfrm>
-                        <a:prstGeom prst="line">
-                          <a:avLst/>
-                        </a:prstGeom>
-                      </wps:spPr>
-                      <wps:style>
-                        <a:lnRef idx="1">
-                          <a:schemeClr val="accent1"/>
-                        </a:lnRef>
-                        <a:fillRef idx="0">
-                          <a:schemeClr val="accent1"/>
-                        </a:fillRef>
-                        <a:effectRef idx="0">
-                          <a:schemeClr val="accent1"/>
-                        </a:effectRef>
-                        <a:fontRef idx="minor">
-                          <a:schemeClr val="tx1"/>
-                        </a:fontRef>
-                      </wps:style>
-                      <wps:bodyPr/>
-                    </wps:wsp>
-                  </a:graphicData>
-                </a:graphic>
-              </wp:anchor>
-            </w:drawing>
-          </mc:Choice>
-          <mc:Fallback>
-            <w:pict>
-              <v:line w14:anchorId="7654529A" id="Connettore diritto 6" o:spid="_x0000_s1026" style="position:absolute;z-index:251674624;visibility:visible;mso-wrap-style:square;mso-wrap-distance-left:9pt;mso-wrap-distance-top:0;mso-wrap-distance-right:9pt;mso-wrap-distance-bottom:0;mso-position-horizontal:absolute;mso-position-horizontal-relative:text;mso-position-vertical:absolute;mso-position-vertical-relative:text" from="0,-.05pt" to="0,102.55pt" o:gfxdata="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" strokecolor="#4472c4 [3204]" strokeweight=".5pt">
-                <v:stroke joinstyle="miter"/>
-              </v:line>
-            </w:pict>
-          </mc:Fallback>
-        </mc:AlternateContent>
-      </w:r>
-    </w:p>
+    <w:p/>
     <w:sectPr>
       <w:pgSz w:w="11906" w:h="16838"/>
       <w:pgMar w:top="1417" w:right="1134" w:bottom="1134" w:left="1134" w:header="708" w:footer="708" w:gutter="0"/>

</xml_diff>